<commit_message>
added the .gitignore file
</commit_message>
<xml_diff>
--- a/Ankush.docx
+++ b/Ankush.docx
@@ -1808,28 +1808,7 @@
           <w:sz w:val="32"/>
           <w:szCs w:val="32"/>
         </w:rPr>
-        <w:t xml:space="preserve">Method </w:t>
-      </w:r>
-      <w:r>
-        <w:rPr>
-          <w:sz w:val="32"/>
-          <w:szCs w:val="32"/>
-        </w:rPr>
-        <w:t xml:space="preserve">2 </w:t>
-      </w:r>
-      <w:r>
-        <w:rPr>
-          <w:sz w:val="32"/>
-          <w:szCs w:val="32"/>
-        </w:rPr>
-        <w:t xml:space="preserve">- Using </w:t>
-      </w:r>
-      <w:r>
-        <w:rPr>
-          <w:sz w:val="32"/>
-          <w:szCs w:val="32"/>
-        </w:rPr>
-        <w:t>Recursion</w:t>
+        <w:t>Method 2 - Using Recursion</w:t>
       </w:r>
     </w:p>
     <w:p>
@@ -2237,21 +2216,7 @@
           <w:sz w:val="32"/>
           <w:szCs w:val="32"/>
         </w:rPr>
-        <w:t xml:space="preserve">Method </w:t>
-      </w:r>
-      <w:r>
-        <w:rPr>
-          <w:sz w:val="32"/>
-          <w:szCs w:val="32"/>
-        </w:rPr>
-        <w:t xml:space="preserve">3 </w:t>
-      </w:r>
-      <w:r>
-        <w:rPr>
-          <w:sz w:val="32"/>
-          <w:szCs w:val="32"/>
-        </w:rPr>
-        <w:t xml:space="preserve">- Using </w:t>
+        <w:t xml:space="preserve">Method 3 - Using </w:t>
       </w:r>
       <w:proofErr w:type="spellStart"/>
       <w:r>
@@ -3968,21 +3933,7 @@
           <w:szCs w:val="32"/>
         </w:rPr>
         <w:lastRenderedPageBreak/>
-        <w:t xml:space="preserve">Question </w:t>
-      </w:r>
-      <w:r>
-        <w:rPr>
-          <w:sz w:val="32"/>
-          <w:szCs w:val="32"/>
-        </w:rPr>
-        <w:t>3</w:t>
-      </w:r>
-      <w:r>
-        <w:rPr>
-          <w:sz w:val="32"/>
-          <w:szCs w:val="32"/>
-        </w:rPr>
-        <w:t>:</w:t>
+        <w:t>Question 3:</w:t>
       </w:r>
     </w:p>
     <w:p>
@@ -5257,21 +5208,7 @@
           <w:sz w:val="32"/>
           <w:szCs w:val="32"/>
         </w:rPr>
-        <w:t xml:space="preserve">Question </w:t>
-      </w:r>
-      <w:r>
-        <w:rPr>
-          <w:sz w:val="32"/>
-          <w:szCs w:val="32"/>
-        </w:rPr>
-        <w:t>4</w:t>
-      </w:r>
-      <w:r>
-        <w:rPr>
-          <w:sz w:val="32"/>
-          <w:szCs w:val="32"/>
-        </w:rPr>
-        <w:t>:</w:t>
+        <w:t>Question 4:</w:t>
       </w:r>
     </w:p>
     <w:p>
@@ -5471,15 +5408,7 @@
           <w:szCs w:val="32"/>
           <w:lang w:val="en-US"/>
         </w:rPr>
-        <w:t xml:space="preserve">Explanation - </w:t>
-      </w:r>
-      <w:r>
-        <w:rPr>
-          <w:sz w:val="32"/>
-          <w:szCs w:val="32"/>
-          <w:lang w:val="en-US"/>
-        </w:rPr>
-        <w:t xml:space="preserve">It selects line number 02, 06 and not any other because </w:t>
+        <w:t xml:space="preserve">Explanation - It selects line number 02, 06 and not any other because </w:t>
       </w:r>
       <w:proofErr w:type="gramStart"/>
       <w:r>
@@ -5605,31 +5534,7 @@
           <w:szCs w:val="32"/>
           <w:lang w:val="en-US"/>
         </w:rPr>
-        <w:t xml:space="preserve">Explanation - </w:t>
-      </w:r>
-      <w:r>
-        <w:rPr>
-          <w:sz w:val="32"/>
-          <w:szCs w:val="32"/>
-          <w:lang w:val="en-US"/>
-        </w:rPr>
-        <w:t>It selects line number 02, 06</w:t>
-      </w:r>
-      <w:r>
-        <w:rPr>
-          <w:sz w:val="32"/>
-          <w:szCs w:val="32"/>
-          <w:lang w:val="en-US"/>
-        </w:rPr>
-        <w:t>, 10</w:t>
-      </w:r>
-      <w:r>
-        <w:rPr>
-          <w:sz w:val="32"/>
-          <w:szCs w:val="32"/>
-          <w:lang w:val="en-US"/>
-        </w:rPr>
-        <w:t xml:space="preserve"> and not any other because </w:t>
+        <w:t xml:space="preserve">Explanation - It selects line number 02, 06, 10 and not any other because </w:t>
       </w:r>
       <w:proofErr w:type="spellStart"/>
       <w:r>
@@ -5790,23 +5695,7 @@
           <w:szCs w:val="32"/>
           <w:lang w:val="en-US"/>
         </w:rPr>
-        <w:t>It selects line number 02,</w:t>
-      </w:r>
-      <w:r>
-        <w:rPr>
-          <w:sz w:val="32"/>
-          <w:szCs w:val="32"/>
-          <w:lang w:val="en-US"/>
-        </w:rPr>
-        <w:t xml:space="preserve"> 04,</w:t>
-      </w:r>
-      <w:r>
-        <w:rPr>
-          <w:sz w:val="32"/>
-          <w:szCs w:val="32"/>
-          <w:lang w:val="en-US"/>
-        </w:rPr>
-        <w:t xml:space="preserve"> 06, 10 and not any other because </w:t>
+        <w:t xml:space="preserve">It selects line number 02, 04, 06, 10 and not any other because </w:t>
       </w:r>
       <w:r>
         <w:rPr>
@@ -6073,31 +5962,7 @@
           <w:szCs w:val="32"/>
           <w:lang w:val="en-US"/>
         </w:rPr>
-        <w:t>It selects line number 02</w:t>
-      </w:r>
-      <w:r>
-        <w:rPr>
-          <w:sz w:val="32"/>
-          <w:szCs w:val="32"/>
-          <w:lang w:val="en-US"/>
-        </w:rPr>
-        <w:t xml:space="preserve"> a</w:t>
-      </w:r>
-      <w:r>
-        <w:rPr>
-          <w:sz w:val="32"/>
-          <w:szCs w:val="32"/>
-          <w:lang w:val="en-US"/>
-        </w:rPr>
-        <w:t xml:space="preserve">nd not any other because </w:t>
-      </w:r>
-      <w:r>
-        <w:rPr>
-          <w:sz w:val="32"/>
-          <w:szCs w:val="32"/>
-          <w:lang w:val="en-US"/>
-        </w:rPr>
-        <w:t>t</w:t>
+        <w:t>It selects line number 02 and not any other because t</w:t>
       </w:r>
       <w:r>
         <w:rPr>
@@ -7638,6 +7503,123 @@
           <w:szCs w:val="32"/>
         </w:rPr>
       </w:pPr>
+    </w:p>
+    <w:p>
+      <w:pPr>
+        <w:rPr>
+          <w:sz w:val="32"/>
+          <w:szCs w:val="32"/>
+          <w:lang w:val="en-US"/>
+        </w:rPr>
+      </w:pPr>
+    </w:p>
+    <w:p>
+      <w:pPr>
+        <w:rPr>
+          <w:sz w:val="40"/>
+          <w:szCs w:val="40"/>
+        </w:rPr>
+      </w:pPr>
+      <w:r>
+        <w:rPr>
+          <w:sz w:val="40"/>
+          <w:szCs w:val="40"/>
+        </w:rPr>
+        <w:t xml:space="preserve">Challenge </w:t>
+      </w:r>
+      <w:r>
+        <w:rPr>
+          <w:sz w:val="40"/>
+          <w:szCs w:val="40"/>
+        </w:rPr>
+        <w:t>2</w:t>
+      </w:r>
+      <w:r>
+        <w:rPr>
+          <w:sz w:val="40"/>
+          <w:szCs w:val="40"/>
+        </w:rPr>
+        <w:t xml:space="preserve">: </w:t>
+      </w:r>
+      <w:proofErr w:type="spellStart"/>
+      <w:r>
+        <w:rPr>
+          <w:sz w:val="40"/>
+          <w:szCs w:val="40"/>
+        </w:rPr>
+        <w:t>ToDo</w:t>
+      </w:r>
+      <w:proofErr w:type="spellEnd"/>
+      <w:r>
+        <w:rPr>
+          <w:sz w:val="40"/>
+          <w:szCs w:val="40"/>
+        </w:rPr>
+        <w:t xml:space="preserve"> App</w:t>
+      </w:r>
+    </w:p>
+    <w:p>
+      <w:pPr>
+        <w:rPr>
+          <w:sz w:val="32"/>
+          <w:szCs w:val="32"/>
+        </w:rPr>
+      </w:pPr>
+      <w:r>
+        <w:rPr>
+          <w:sz w:val="32"/>
+          <w:szCs w:val="32"/>
+        </w:rPr>
+        <w:t>Repository Link:</w:t>
+      </w:r>
+    </w:p>
+    <w:p>
+      <w:pPr>
+        <w:rPr>
+          <w:sz w:val="32"/>
+          <w:szCs w:val="32"/>
+        </w:rPr>
+      </w:pPr>
+      <w:hyperlink r:id="rId7" w:history="1">
+        <w:r>
+          <w:rPr>
+            <w:rStyle w:val="Hyperlink"/>
+            <w:sz w:val="32"/>
+            <w:szCs w:val="32"/>
+          </w:rPr>
+          <w:t>https://github.com/ankush-jamuar/Ziptrip/tree/main/challenge-2</w:t>
+        </w:r>
+      </w:hyperlink>
+    </w:p>
+    <w:p>
+      <w:pPr>
+        <w:rPr>
+          <w:sz w:val="32"/>
+          <w:szCs w:val="32"/>
+        </w:rPr>
+      </w:pPr>
+      <w:r>
+        <w:rPr>
+          <w:sz w:val="32"/>
+          <w:szCs w:val="32"/>
+        </w:rPr>
+        <w:t>Note:</w:t>
+      </w:r>
+    </w:p>
+    <w:p>
+      <w:pPr>
+        <w:rPr>
+          <w:sz w:val="32"/>
+          <w:szCs w:val="32"/>
+        </w:rPr>
+      </w:pPr>
+      <w:r>
+        <w:rPr>
+          <w:sz w:val="32"/>
+          <w:szCs w:val="32"/>
+        </w:rPr>
+        <w:t>The project is fully implemented, documented, and runnable locally. Detailed setup instructions are included in the repository README.</w:t>
+      </w:r>
     </w:p>
     <w:p>
       <w:pPr>
@@ -9570,6 +9552,7 @@
   <w:style w:type="character" w:default="1" w:styleId="DefaultParagraphFont">
     <w:name w:val="Default Paragraph Font"/>
     <w:uiPriority w:val="1"/>
+    <w:semiHidden/>
     <w:unhideWhenUsed/>
   </w:style>
   <w:style w:type="table" w:default="1" w:styleId="TableNormal">
@@ -9647,6 +9630,29 @@
       <w:ind w:left="720"/>
       <w:contextualSpacing/>
     </w:pPr>
+  </w:style>
+  <w:style w:type="character" w:styleId="Hyperlink">
+    <w:name w:val="Hyperlink"/>
+    <w:basedOn w:val="DefaultParagraphFont"/>
+    <w:uiPriority w:val="99"/>
+    <w:unhideWhenUsed/>
+    <w:rsid w:val="007431D1"/>
+    <w:rPr>
+      <w:color w:val="0000FF" w:themeColor="hyperlink"/>
+      <w:u w:val="single"/>
+    </w:rPr>
+  </w:style>
+  <w:style w:type="character" w:styleId="UnresolvedMention">
+    <w:name w:val="Unresolved Mention"/>
+    <w:basedOn w:val="DefaultParagraphFont"/>
+    <w:uiPriority w:val="99"/>
+    <w:semiHidden/>
+    <w:unhideWhenUsed/>
+    <w:rsid w:val="007431D1"/>
+    <w:rPr>
+      <w:color w:val="605E5C"/>
+      <w:shd w:val="clear" w:color="auto" w:fill="E1DFDD"/>
+    </w:rPr>
   </w:style>
 </w:styles>
 </file>

</xml_diff>